<commit_message>
feat: update contract templates to EN_v2 + add Consent Passport
- Replace all 5 contract docx + pdf files with EN_v2 versions
- Add new Consent-Passport.docx and Consent-Passport.pdf
- API route ALLOWED_FILES includes Consent-Passport
- /contracts page shows Consent Passport as new card
- /contracts/payment CONTRACT_LABELS includes Consent Passport
- Translations: fileConsentPassport + fileConsentPassportDesc

Co-Authored-By: Hang <hangdivision@gmail.com>
</commit_message>
<xml_diff>
--- a/public/contracts/03-Endorsement-License-Agreement.docx
+++ b/public/contracts/03-Endorsement-License-Agreement.docx
@@ -57,23 +57,13 @@
           <w:lang w:eastAsia="zh-CN"/>
         </w:rPr>
       </w:pPr>
-      <w:proofErr w:type="spellStart"/>
       <w:r>
         <w:rPr>
           <w:b/>
           <w:color w:val="244169"/>
           <w:sz w:val="24"/>
         </w:rPr>
-        <w:t>PortraitPay</w:t>
-      </w:r>
-      <w:proofErr w:type="spellEnd"/>
-      <w:r>
-        <w:rPr>
-          <w:b/>
-          <w:color w:val="244169"/>
-          <w:sz w:val="24"/>
-        </w:rPr>
-        <w:t xml:space="preserve"> AI</w:t>
+        <w:t>PortraitPay AI</w:t>
       </w:r>
     </w:p>
     <w:p/>
@@ -585,10 +575,7 @@
         </w:rPr>
       </w:pPr>
       <w:r>
-        <w:rPr>
-          <w:color w:val="1A1A1A"/>
-        </w:rPr>
-        <w:t>The Brand is authorized to use the Endorsed Portrait in: advertising campaigns across all media; product packaging and labeling; social media posts and paid promotions; press releases and public announcements; point-of-sale and retail materials. Face verification at mint time is required to ensure authenticity of the digital portrait.</w:t>
+        <w:t>The Brand is authorized to use the Endorsed Portrait in: advertising campaigns across all media; product packaging and labeling; social media posts and paid promotions; press releases and public announcements; point-of-sale and retail materials. Face verification is required at signing to ensure authenticity of the digital portrait.</w:t>
       </w:r>
     </w:p>
     <w:p>
@@ -1454,32 +1441,7 @@
           <w:color w:val="12313A"/>
           <w:lang w:eastAsia="zh-CN"/>
         </w:rPr>
-        <w:t xml:space="preserve">This template was generated by </w:t>
-      </w:r>
-      <w:proofErr w:type="spellStart"/>
-      <w:r>
-        <w:rPr>
-          <w:rFonts w:eastAsia="宋体"/>
-          <w:color w:val="12313A"/>
-          <w:lang w:eastAsia="zh-CN"/>
-        </w:rPr>
-        <w:t>PortraitPay</w:t>
-      </w:r>
-      <w:proofErr w:type="spellEnd"/>
-      <w:r>
-        <w:rPr>
-          <w:rFonts w:eastAsia="宋体"/>
-          <w:color w:val="12313A"/>
-          <w:lang w:eastAsia="zh-CN"/>
-        </w:rPr>
-        <w:t xml:space="preserve"> AI</w:t>
-      </w:r>
-      <w:r>
-        <w:rPr>
-          <w:rFonts w:eastAsia="宋体"/>
-          <w:color w:val="12313A"/>
-          <w:lang w:eastAsia="zh-CN"/>
-        </w:rPr>
+        <w:t>This template was generated by PortraitPay AI</w:t>
         <w:br/>
       </w:r>
       <w:r>

</xml_diff>